<commit_message>
Added the required scanned pages and combined the documentation PDF
</commit_message>
<xml_diff>
--- a/Documentation/T_Iliyan_Antov_101324019.docx
+++ b/Documentation/T_Iliyan_Antov_101324019.docx
@@ -40,7 +40,7 @@
                 <w:lang w:val="bg-BG"/>
               </w:rPr>
               <w:drawing>
-                <wp:inline distT="0" distB="0" distL="0" distR="0" wp14:anchorId="68A77597" wp14:editId="72CF895F">
+                <wp:inline distT="0" distB="0" distL="0" distR="0" wp14:anchorId="68A77597" wp14:editId="54AC603F">
                   <wp:extent cx="579755" cy="581660"/>
                   <wp:effectExtent l="0" t="0" r="0" b="0"/>
                   <wp:docPr id="944511881" name="Picture 2"/>
@@ -594,8 +594,8 @@
         <w:tblLook w:val="01E0" w:firstRow="1" w:lastRow="1" w:firstColumn="1" w:lastColumn="1" w:noHBand="0" w:noVBand="0"/>
       </w:tblPr>
       <w:tblGrid>
-        <w:gridCol w:w="2520"/>
-        <w:gridCol w:w="5040"/>
+        <w:gridCol w:w="2742"/>
+        <w:gridCol w:w="4818"/>
       </w:tblGrid>
       <w:tr>
         <w:tc>
@@ -614,6 +614,7 @@
           </w:p>
           <w:p>
             <w:pPr>
+              <w:ind w:left="229"/>
               <w:jc w:val="right"/>
               <w:rPr>
                 <w:b/>

</xml_diff>